<commit_message>
chore: Update docx templates with actual dynamic tags
</commit_message>
<xml_diff>
--- a/backend/assets/templates/commercial_proposal_template.docx
+++ b/backend/assets/templates/commercial_proposal_template.docx
@@ -405,7 +405,6 @@
                 <w:bCs/>
                 <w:sz w:val="22"/>
                 <w:szCs w:val="22"/>
-                <w:highlight w:val="yellow"/>
               </w:rPr>
               <w:t>Sanctioned Load</w:t>
             </w:r>
@@ -436,7 +435,6 @@
                 <w:bCs/>
                 <w:sz w:val="22"/>
                 <w:szCs w:val="22"/>
-                <w:highlight w:val="yellow"/>
               </w:rPr>
               <w:t>Connectivity</w:t>
             </w:r>
@@ -467,7 +465,6 @@
                 <w:bCs/>
                 <w:sz w:val="22"/>
                 <w:szCs w:val="22"/>
-                <w:highlight w:val="yellow"/>
               </w:rPr>
               <w:t>DISCOM Name</w:t>
             </w:r>
@@ -498,7 +495,6 @@
                 <w:bCs/>
                 <w:sz w:val="22"/>
                 <w:szCs w:val="22"/>
-                <w:highlight w:val="yellow"/>
               </w:rPr>
               <w:t>Feeder Type</w:t>
             </w:r>
@@ -511,18 +507,9 @@
             <w:tcW w:w="2534" w:type="dxa"/>
           </w:tcPr>
           <w:p>
-            <w:pPr>
-              <w:jc w:val="both"/>
-              <w:outlineLvl w:val="2"/>
-              <w:rPr>
-                <w:rFonts w:asciiTheme="minorHAnsi" w:hAnsiTheme="minorHAnsi"/>
-                <w:b/>
-                <w:bCs/>
-                <w:sz w:val="22"/>
-                <w:szCs w:val="22"/>
-                <w:highlight w:val="yellow"/>
-              </w:rPr>
-            </w:pPr>
+            <w:r>
+              <w:t>&lt;&lt;sanctionedLoadKw&gt;&gt; kW</w:t>
+            </w:r>
           </w:p>
         </w:tc>
         <w:tc>
@@ -530,18 +517,9 @@
             <w:tcW w:w="2140" w:type="dxa"/>
           </w:tcPr>
           <w:p>
-            <w:pPr>
-              <w:jc w:val="both"/>
-              <w:outlineLvl w:val="2"/>
-              <w:rPr>
-                <w:rFonts w:asciiTheme="minorHAnsi" w:hAnsiTheme="minorHAnsi"/>
-                <w:b/>
-                <w:bCs/>
-                <w:sz w:val="22"/>
-                <w:szCs w:val="22"/>
-                <w:highlight w:val="yellow"/>
-              </w:rPr>
-            </w:pPr>
+            <w:r>
+              <w:t>&lt;&lt;voltageLevel&gt;&gt;</w:t>
+            </w:r>
           </w:p>
         </w:tc>
         <w:tc>
@@ -549,18 +527,9 @@
             <w:tcW w:w="2434" w:type="dxa"/>
           </w:tcPr>
           <w:p>
-            <w:pPr>
-              <w:jc w:val="both"/>
-              <w:outlineLvl w:val="2"/>
-              <w:rPr>
-                <w:rFonts w:asciiTheme="minorHAnsi" w:hAnsiTheme="minorHAnsi"/>
-                <w:b/>
-                <w:bCs/>
-                <w:sz w:val="22"/>
-                <w:szCs w:val="22"/>
-                <w:highlight w:val="yellow"/>
-              </w:rPr>
-            </w:pPr>
+            <w:r>
+              <w:t>&lt;&lt;discom&gt;&gt;</w:t>
+            </w:r>
           </w:p>
         </w:tc>
         <w:tc>
@@ -568,18 +537,9 @@
             <w:tcW w:w="2380" w:type="dxa"/>
           </w:tcPr>
           <w:p>
-            <w:pPr>
-              <w:jc w:val="both"/>
-              <w:outlineLvl w:val="2"/>
-              <w:rPr>
-                <w:rFonts w:asciiTheme="minorHAnsi" w:hAnsiTheme="minorHAnsi"/>
-                <w:b/>
-                <w:bCs/>
-                <w:sz w:val="22"/>
-                <w:szCs w:val="22"/>
-                <w:highlight w:val="yellow"/>
-              </w:rPr>
-            </w:pPr>
+            <w:r>
+              <w:t>&lt;&lt;industryName&gt;&gt;</w:t>
+            </w:r>
           </w:p>
         </w:tc>
       </w:tr>

</xml_diff>

<commit_message>
fix: make remaining Ayurveda text dynamic
</commit_message>
<xml_diff>
--- a/backend/assets/templates/commercial_proposal_template.docx
+++ b/backend/assets/templates/commercial_proposal_template.docx
@@ -301,9 +301,8 @@
           <w:bCs/>
           <w:sz w:val="36"/>
           <w:szCs w:val="36"/>
-          <w:highlight w:val="yellow"/>
         </w:rPr>
-        <w:t>XXXXXXXXXXXXX</w:t>
+        <w:t>&lt;&lt;xxxxxxxxxxxxx&gt;&gt;</w:t>
       </w:r>
     </w:p>
     <w:p>
@@ -8150,9 +8149,8 @@
                 <w:rFonts w:ascii="Aptos" w:hAnsi="Aptos" w:cs="Arial"/>
                 <w:sz w:val="20"/>
                 <w:szCs w:val="20"/>
-                <w:highlight w:val="yellow"/>
-              </w:rPr>
-              <w:t>₹450,000.00</w:t>
+              </w:rPr>
+              <w:t>&lt;&lt;45000000&gt;&gt;</w:t>
             </w:r>
           </w:p>
         </w:tc>
@@ -8388,9 +8386,8 @@
                 <w:rFonts w:ascii="Aptos" w:hAnsi="Aptos" w:cs="Arial"/>
                 <w:sz w:val="20"/>
                 <w:szCs w:val="20"/>
-                <w:highlight w:val="yellow"/>
-              </w:rPr>
-              <w:t>₹350,000.00</w:t>
+              </w:rPr>
+              <w:t>&lt;&lt;35000000&gt;&gt;</w:t>
             </w:r>
           </w:p>
         </w:tc>
@@ -8641,9 +8638,8 @@
                 <w:rFonts w:ascii="Aptos" w:hAnsi="Aptos" w:cs="Arial"/>
                 <w:sz w:val="20"/>
                 <w:szCs w:val="20"/>
-                <w:highlight w:val="yellow"/>
-              </w:rPr>
-              <w:t>₹300,000.00</w:t>
+              </w:rPr>
+              <w:t>&lt;&lt;30000000&gt;&gt;</w:t>
             </w:r>
           </w:p>
         </w:tc>
@@ -9517,9 +9513,8 @@
                 <w:rFonts w:ascii="Aptos" w:hAnsi="Aptos" w:cs="Arial"/>
                 <w:sz w:val="20"/>
                 <w:szCs w:val="20"/>
-                <w:highlight w:val="yellow"/>
-              </w:rPr>
-              <w:t>1,50,000.00</w:t>
+              </w:rPr>
+              <w:t>&lt;&lt;15000000&gt;&gt;</w:t>
             </w:r>
           </w:p>
         </w:tc>
@@ -10322,9 +10317,8 @@
                 <w:rFonts w:ascii="Aptos" w:hAnsi="Aptos" w:cs="Arial"/>
                 <w:sz w:val="20"/>
                 <w:szCs w:val="20"/>
-                <w:highlight w:val="yellow"/>
-              </w:rPr>
-              <w:t>20,000.00</w:t>
+              </w:rPr>
+              <w:t>&lt;&lt;2000000&gt;&gt;</w:t>
             </w:r>
           </w:p>
         </w:tc>
@@ -10630,9 +10624,8 @@
                 <w:rFonts w:ascii="Aptos" w:hAnsi="Aptos" w:cs="Arial"/>
                 <w:sz w:val="20"/>
                 <w:szCs w:val="20"/>
-                <w:highlight w:val="yellow"/>
-              </w:rPr>
-              <w:t>2p/kWh</w:t>
+              </w:rPr>
+              <w:t>&lt;&lt;2pkwh&gt;&gt;</w:t>
             </w:r>
           </w:p>
         </w:tc>
@@ -10839,9 +10832,8 @@
                 <w:rFonts w:ascii="Aptos" w:hAnsi="Aptos" w:cs="Arial"/>
                 <w:sz w:val="20"/>
                 <w:szCs w:val="20"/>
-                <w:highlight w:val="yellow"/>
-              </w:rPr>
-              <w:t>2p/kWh</w:t>
+              </w:rPr>
+              <w:t>&lt;&lt;2pkwh&gt;&gt;</w:t>
             </w:r>
           </w:p>
         </w:tc>
@@ -11064,9 +11056,8 @@
                 <w:rFonts w:ascii="Aptos" w:hAnsi="Aptos" w:cs="Arial"/>
                 <w:sz w:val="20"/>
                 <w:szCs w:val="20"/>
-                <w:highlight w:val="yellow"/>
-              </w:rPr>
-              <w:t>15%</w:t>
+              </w:rPr>
+              <w:t>&lt;&lt;15&gt;&gt;</w:t>
             </w:r>
           </w:p>
         </w:tc>
@@ -12079,9 +12070,8 @@
                 <w:rFonts w:ascii="Aptos" w:hAnsi="Aptos"/>
                 <w:sz w:val="20"/>
                 <w:szCs w:val="20"/>
-                <w:highlight w:val="yellow"/>
-              </w:rPr>
-              <w:t>100% Advance against PO/PI</w:t>
+              </w:rPr>
+              <w:t>&lt;&lt;longTextTag&gt;&gt;</w:t>
             </w:r>
           </w:p>
           <w:p>

</xml_diff>

<commit_message>
fix: correctly replace last image with chart and add 95% dynamic tag
</commit_message>
<xml_diff>
--- a/backend/assets/templates/commercial_proposal_template.docx
+++ b/backend/assets/templates/commercial_proposal_template.docx
@@ -12919,74 +12919,7 @@
     <w:p/>
     <w:p>
       <w:r>
-        <w:rPr>
-          <w:rFonts w:asciiTheme="minorHAnsi" w:hAnsiTheme="minorHAnsi"/>
-          <w:noProof/>
-        </w:rPr>
-        <w:lastRenderedPageBreak/>
-        <w:drawing>
-          <wp:anchor distT="0" distB="0" distL="114300" distR="114300" simplePos="0" relativeHeight="251665408" behindDoc="1" locked="0" layoutInCell="1" allowOverlap="1" wp14:anchorId="6DC9D02D" wp14:editId="0282E8B5">
-            <wp:simplePos x="0" y="0"/>
-            <wp:positionH relativeFrom="page">
-              <wp:align>left</wp:align>
-            </wp:positionH>
-            <wp:positionV relativeFrom="paragraph">
-              <wp:posOffset>0</wp:posOffset>
-            </wp:positionV>
-            <wp:extent cx="7596505" cy="9930765"/>
-            <wp:effectExtent l="0" t="0" r="4445" b="0"/>
-            <wp:wrapTight wrapText="bothSides">
-              <wp:wrapPolygon edited="0">
-                <wp:start x="0" y="0"/>
-                <wp:lineTo x="0" y="21546"/>
-                <wp:lineTo x="21558" y="21546"/>
-                <wp:lineTo x="21558" y="0"/>
-                <wp:lineTo x="0" y="0"/>
-              </wp:wrapPolygon>
-            </wp:wrapTight>
-            <wp:docPr id="1443243417" name="Picture 1"/>
-            <wp:cNvGraphicFramePr>
-              <a:graphicFrameLocks xmlns:a="http://schemas.openxmlformats.org/drawingml/2006/main" noChangeAspect="1"/>
-            </wp:cNvGraphicFramePr>
-            <a:graphic xmlns:a="http://schemas.openxmlformats.org/drawingml/2006/main">
-              <a:graphicData uri="http://schemas.openxmlformats.org/drawingml/2006/picture">
-                <pic:pic xmlns:pic="http://schemas.openxmlformats.org/drawingml/2006/picture">
-                  <pic:nvPicPr>
-                    <pic:cNvPr id="1443243417" name=""/>
-                    <pic:cNvPicPr/>
-                  </pic:nvPicPr>
-                  <pic:blipFill>
-                    <a:blip r:embed="rId9">
-                      <a:extLst>
-                        <a:ext uri="{28A0092B-C50C-407E-A947-70E740481C1C}">
-                          <a14:useLocalDpi xmlns:a14="http://schemas.microsoft.com/office/drawing/2010/main" val="0"/>
-                        </a:ext>
-                      </a:extLst>
-                    </a:blip>
-                    <a:stretch>
-                      <a:fillRect/>
-                    </a:stretch>
-                  </pic:blipFill>
-                  <pic:spPr>
-                    <a:xfrm>
-                      <a:off x="0" y="0"/>
-                      <a:ext cx="7596505" cy="9930765"/>
-                    </a:xfrm>
-                    <a:prstGeom prst="rect">
-                      <a:avLst/>
-                    </a:prstGeom>
-                  </pic:spPr>
-                </pic:pic>
-              </a:graphicData>
-            </a:graphic>
-            <wp14:sizeRelH relativeFrom="page">
-              <wp14:pctWidth>0</wp14:pctWidth>
-            </wp14:sizeRelH>
-            <wp14:sizeRelV relativeFrom="page">
-              <wp14:pctHeight>0</wp14:pctHeight>
-            </wp14:sizeRelV>
-          </wp:anchor>
-        </w:drawing>
+        <w:t>{%monthly_savings_chart}</w:t>
       </w:r>
     </w:p>
     <w:sectPr>

</xml_diff>

<commit_message>
chore: re-apply docx template dynamic fields
</commit_message>
<xml_diff>
--- a/backend/assets/templates/commercial_proposal_template.docx
+++ b/backend/assets/templates/commercial_proposal_template.docx
@@ -12919,7 +12919,74 @@
     <w:p/>
     <w:p>
       <w:r>
-        <w:t>{%monthly_savings_chart}</w:t>
+        <w:rPr>
+          <w:rFonts w:asciiTheme="minorHAnsi" w:hAnsiTheme="minorHAnsi"/>
+          <w:noProof/>
+        </w:rPr>
+        <w:lastRenderedPageBreak/>
+        <w:drawing>
+          <wp:anchor distT="0" distB="0" distL="114300" distR="114300" simplePos="0" relativeHeight="251665408" behindDoc="1" locked="0" layoutInCell="1" allowOverlap="1" wp14:anchorId="6DC9D02D" wp14:editId="0282E8B5">
+            <wp:simplePos x="0" y="0"/>
+            <wp:positionH relativeFrom="page">
+              <wp:align>left</wp:align>
+            </wp:positionH>
+            <wp:positionV relativeFrom="paragraph">
+              <wp:posOffset>0</wp:posOffset>
+            </wp:positionV>
+            <wp:extent cx="7596505" cy="9930765"/>
+            <wp:effectExtent l="0" t="0" r="4445" b="0"/>
+            <wp:wrapTight wrapText="bothSides">
+              <wp:wrapPolygon edited="0">
+                <wp:start x="0" y="0"/>
+                <wp:lineTo x="0" y="21546"/>
+                <wp:lineTo x="21558" y="21546"/>
+                <wp:lineTo x="21558" y="0"/>
+                <wp:lineTo x="0" y="0"/>
+              </wp:wrapPolygon>
+            </wp:wrapTight>
+            <wp:docPr id="1443243417" name="Picture 1"/>
+            <wp:cNvGraphicFramePr>
+              <a:graphicFrameLocks xmlns:a="http://schemas.openxmlformats.org/drawingml/2006/main" noChangeAspect="1"/>
+            </wp:cNvGraphicFramePr>
+            <a:graphic xmlns:a="http://schemas.openxmlformats.org/drawingml/2006/main">
+              <a:graphicData uri="http://schemas.openxmlformats.org/drawingml/2006/picture">
+                <pic:pic xmlns:pic="http://schemas.openxmlformats.org/drawingml/2006/picture">
+                  <pic:nvPicPr>
+                    <pic:cNvPr id="1443243417" name=""/>
+                    <pic:cNvPicPr/>
+                  </pic:nvPicPr>
+                  <pic:blipFill>
+                    <a:blip r:embed="rId9">
+                      <a:extLst>
+                        <a:ext uri="{28A0092B-C50C-407E-A947-70E740481C1C}">
+                          <a14:useLocalDpi xmlns:a14="http://schemas.microsoft.com/office/drawing/2010/main" val="0"/>
+                        </a:ext>
+                      </a:extLst>
+                    </a:blip>
+                    <a:stretch>
+                      <a:fillRect/>
+                    </a:stretch>
+                  </pic:blipFill>
+                  <pic:spPr>
+                    <a:xfrm>
+                      <a:off x="0" y="0"/>
+                      <a:ext cx="7596505" cy="9930765"/>
+                    </a:xfrm>
+                    <a:prstGeom prst="rect">
+                      <a:avLst/>
+                    </a:prstGeom>
+                  </pic:spPr>
+                </pic:pic>
+              </a:graphicData>
+            </a:graphic>
+            <wp14:sizeRelH relativeFrom="page">
+              <wp14:pctWidth>0</wp14:pctWidth>
+            </wp14:sizeRelH>
+            <wp14:sizeRelV relativeFrom="page">
+              <wp14:pctHeight>0</wp14:pctHeight>
+            </wp14:sizeRelV>
+          </wp:anchor>
+        </w:drawing>
       </w:r>
     </w:p>
     <w:sectPr>

</xml_diff>

<commit_message>
feat: Implement interactive Commercial Proposal modal form & DOCX generator from COMMERCIAL PROPOSAL_V2.docx
</commit_message>
<xml_diff>
--- a/backend/assets/templates/commercial_proposal_template.docx
+++ b/backend/assets/templates/commercial_proposal_template.docx
@@ -301,8 +301,9 @@
           <w:bCs/>
           <w:sz w:val="36"/>
           <w:szCs w:val="36"/>
+          <w:highlight w:val="yellow"/>
         </w:rPr>
-        <w:t>&lt;&lt;xxxxxxxxxxxxx&gt;&gt;</w:t>
+        <w:t>XXXXXXXXXXXXX</w:t>
       </w:r>
     </w:p>
     <w:p>
@@ -404,6 +405,7 @@
                 <w:bCs/>
                 <w:sz w:val="22"/>
                 <w:szCs w:val="22"/>
+                <w:highlight w:val="yellow"/>
               </w:rPr>
               <w:t>Sanctioned Load</w:t>
             </w:r>
@@ -434,6 +436,7 @@
                 <w:bCs/>
                 <w:sz w:val="22"/>
                 <w:szCs w:val="22"/>
+                <w:highlight w:val="yellow"/>
               </w:rPr>
               <w:t>Connectivity</w:t>
             </w:r>
@@ -464,6 +467,7 @@
                 <w:bCs/>
                 <w:sz w:val="22"/>
                 <w:szCs w:val="22"/>
+                <w:highlight w:val="yellow"/>
               </w:rPr>
               <w:t>DISCOM Name</w:t>
             </w:r>
@@ -494,6 +498,7 @@
                 <w:bCs/>
                 <w:sz w:val="22"/>
                 <w:szCs w:val="22"/>
+                <w:highlight w:val="yellow"/>
               </w:rPr>
               <w:t>Feeder Type</w:t>
             </w:r>
@@ -506,9 +511,18 @@
             <w:tcW w:w="2534" w:type="dxa"/>
           </w:tcPr>
           <w:p>
-            <w:r>
-              <w:t>&lt;&lt;sanctionedLoadKw&gt;&gt; kW</w:t>
-            </w:r>
+            <w:pPr>
+              <w:jc w:val="both"/>
+              <w:outlineLvl w:val="2"/>
+              <w:rPr>
+                <w:rFonts w:asciiTheme="minorHAnsi" w:hAnsiTheme="minorHAnsi"/>
+                <w:b/>
+                <w:bCs/>
+                <w:sz w:val="22"/>
+                <w:szCs w:val="22"/>
+                <w:highlight w:val="yellow"/>
+              </w:rPr>
+            </w:pPr>
           </w:p>
         </w:tc>
         <w:tc>
@@ -516,9 +530,18 @@
             <w:tcW w:w="2140" w:type="dxa"/>
           </w:tcPr>
           <w:p>
-            <w:r>
-              <w:t>&lt;&lt;voltageLevel&gt;&gt;</w:t>
-            </w:r>
+            <w:pPr>
+              <w:jc w:val="both"/>
+              <w:outlineLvl w:val="2"/>
+              <w:rPr>
+                <w:rFonts w:asciiTheme="minorHAnsi" w:hAnsiTheme="minorHAnsi"/>
+                <w:b/>
+                <w:bCs/>
+                <w:sz w:val="22"/>
+                <w:szCs w:val="22"/>
+                <w:highlight w:val="yellow"/>
+              </w:rPr>
+            </w:pPr>
           </w:p>
         </w:tc>
         <w:tc>
@@ -526,9 +549,18 @@
             <w:tcW w:w="2434" w:type="dxa"/>
           </w:tcPr>
           <w:p>
-            <w:r>
-              <w:t>&lt;&lt;discom&gt;&gt;</w:t>
-            </w:r>
+            <w:pPr>
+              <w:jc w:val="both"/>
+              <w:outlineLvl w:val="2"/>
+              <w:rPr>
+                <w:rFonts w:asciiTheme="minorHAnsi" w:hAnsiTheme="minorHAnsi"/>
+                <w:b/>
+                <w:bCs/>
+                <w:sz w:val="22"/>
+                <w:szCs w:val="22"/>
+                <w:highlight w:val="yellow"/>
+              </w:rPr>
+            </w:pPr>
           </w:p>
         </w:tc>
         <w:tc>
@@ -536,9 +568,18 @@
             <w:tcW w:w="2380" w:type="dxa"/>
           </w:tcPr>
           <w:p>
-            <w:r>
-              <w:t>&lt;&lt;industryName&gt;&gt;</w:t>
-            </w:r>
+            <w:pPr>
+              <w:jc w:val="both"/>
+              <w:outlineLvl w:val="2"/>
+              <w:rPr>
+                <w:rFonts w:asciiTheme="minorHAnsi" w:hAnsiTheme="minorHAnsi"/>
+                <w:b/>
+                <w:bCs/>
+                <w:sz w:val="22"/>
+                <w:szCs w:val="22"/>
+                <w:highlight w:val="yellow"/>
+              </w:rPr>
+            </w:pPr>
           </w:p>
         </w:tc>
       </w:tr>
@@ -8149,8 +8190,9 @@
                 <w:rFonts w:ascii="Aptos" w:hAnsi="Aptos" w:cs="Arial"/>
                 <w:sz w:val="20"/>
                 <w:szCs w:val="20"/>
-              </w:rPr>
-              <w:t>&lt;&lt;45000000&gt;&gt;</w:t>
+                <w:highlight w:val="yellow"/>
+              </w:rPr>
+              <w:t>₹450,000.00</w:t>
             </w:r>
           </w:p>
         </w:tc>
@@ -8386,8 +8428,9 @@
                 <w:rFonts w:ascii="Aptos" w:hAnsi="Aptos" w:cs="Arial"/>
                 <w:sz w:val="20"/>
                 <w:szCs w:val="20"/>
-              </w:rPr>
-              <w:t>&lt;&lt;35000000&gt;&gt;</w:t>
+                <w:highlight w:val="yellow"/>
+              </w:rPr>
+              <w:t>₹350,000.00</w:t>
             </w:r>
           </w:p>
         </w:tc>
@@ -8638,8 +8681,9 @@
                 <w:rFonts w:ascii="Aptos" w:hAnsi="Aptos" w:cs="Arial"/>
                 <w:sz w:val="20"/>
                 <w:szCs w:val="20"/>
-              </w:rPr>
-              <w:t>&lt;&lt;30000000&gt;&gt;</w:t>
+                <w:highlight w:val="yellow"/>
+              </w:rPr>
+              <w:t>₹300,000.00</w:t>
             </w:r>
           </w:p>
         </w:tc>
@@ -9513,8 +9557,9 @@
                 <w:rFonts w:ascii="Aptos" w:hAnsi="Aptos" w:cs="Arial"/>
                 <w:sz w:val="20"/>
                 <w:szCs w:val="20"/>
-              </w:rPr>
-              <w:t>&lt;&lt;15000000&gt;&gt;</w:t>
+                <w:highlight w:val="yellow"/>
+              </w:rPr>
+              <w:t>1,50,000.00</w:t>
             </w:r>
           </w:p>
         </w:tc>
@@ -10317,8 +10362,9 @@
                 <w:rFonts w:ascii="Aptos" w:hAnsi="Aptos" w:cs="Arial"/>
                 <w:sz w:val="20"/>
                 <w:szCs w:val="20"/>
-              </w:rPr>
-              <w:t>&lt;&lt;2000000&gt;&gt;</w:t>
+                <w:highlight w:val="yellow"/>
+              </w:rPr>
+              <w:t>20,000.00</w:t>
             </w:r>
           </w:p>
         </w:tc>
@@ -10624,8 +10670,9 @@
                 <w:rFonts w:ascii="Aptos" w:hAnsi="Aptos" w:cs="Arial"/>
                 <w:sz w:val="20"/>
                 <w:szCs w:val="20"/>
-              </w:rPr>
-              <w:t>&lt;&lt;2pkwh&gt;&gt;</w:t>
+                <w:highlight w:val="yellow"/>
+              </w:rPr>
+              <w:t>2p/kWh</w:t>
             </w:r>
           </w:p>
         </w:tc>
@@ -10832,8 +10879,9 @@
                 <w:rFonts w:ascii="Aptos" w:hAnsi="Aptos" w:cs="Arial"/>
                 <w:sz w:val="20"/>
                 <w:szCs w:val="20"/>
-              </w:rPr>
-              <w:t>&lt;&lt;2pkwh&gt;&gt;</w:t>
+                <w:highlight w:val="yellow"/>
+              </w:rPr>
+              <w:t>2p/kWh</w:t>
             </w:r>
           </w:p>
         </w:tc>
@@ -11056,8 +11104,9 @@
                 <w:rFonts w:ascii="Aptos" w:hAnsi="Aptos" w:cs="Arial"/>
                 <w:sz w:val="20"/>
                 <w:szCs w:val="20"/>
-              </w:rPr>
-              <w:t>&lt;&lt;15&gt;&gt;</w:t>
+                <w:highlight w:val="yellow"/>
+              </w:rPr>
+              <w:t>15%</w:t>
             </w:r>
           </w:p>
         </w:tc>
@@ -12070,8 +12119,9 @@
                 <w:rFonts w:ascii="Aptos" w:hAnsi="Aptos"/>
                 <w:sz w:val="20"/>
                 <w:szCs w:val="20"/>
-              </w:rPr>
-              <w:t>&lt;&lt;longTextTag&gt;&gt;</w:t>
+                <w:highlight w:val="yellow"/>
+              </w:rPr>
+              <w:t>100% Advance against PO/PI</w:t>
             </w:r>
           </w:p>
           <w:p>

</xml_diff>